<commit_message>
docs(entrega): actualizar enlaces interactivos de Figma, pantallas W4b-W5b y PDF compilado
</commit_message>
<xml_diff>
--- a/APE4_Fase1/06_documento/APE4_Fase1_CafeU.docx
+++ b/APE4_Fase1/06_documento/APE4_Fase1_CafeU.docx
@@ -6709,7 +6709,7 @@
           <w:rFonts w:ascii="Times New Roman" w:hAnsi="Times New Roman"/>
           <w:b/>
         </w:rPr>
-        <w:t xml:space="preserve">Enlace al prototipo en Figma: </w:t>
+        <w:t xml:space="preserve">Wireflow del taller en Figma: </w:t>
       </w:r>
       <w:hyperlink r:id="rIdFigma" w:history="1">
         <w:r>
@@ -6734,21 +6734,77 @@
       <w:r>
         <w:rPr>
           <w:rFonts w:ascii="Times New Roman" w:hAnsi="Times New Roman"/>
-        </w:rPr>
-        <w:t xml:space="preserve">Para completar la aplicación se diseñaron siete wireframes (la guía pide un mínimo de cuatro) en escala de grises, con el mismo marco y los mismos componentes, y se conectaron en un </w:t>
-      </w:r>
-      <w:r>
-        <w:rPr>
-          <w:rFonts w:ascii="Times New Roman" w:hAnsi="Times New Roman"/>
           <w:b/>
         </w:rPr>
+        <w:t xml:space="preserve">Prototipo navegable en Figma (W1 – W7 y E1 – E4): </w:t>
+      </w:r>
+      <w:hyperlink r:id="rIdFigma2" w:history="1">
+        <w:r>
+          <w:rPr>
+            <w:rFonts w:ascii="Times New Roman" w:hAnsi="Times New Roman"/>
+            <w:color w:val="0563C1"/>
+            <w:u w:val="single"/>
+          </w:rPr>
+          <w:t xml:space="preserve">https://www.figma.com/proto/0bxGDlHenLKFwC9IroyRXt?node-id=2-4&amp;starting-point-node-id=2%3A4</w:t>
+        </w:r>
+      </w:hyperlink>
+    </w:p>
+    <w:p>
+      <w:pPr>
+        <w:spacing w:after="120" w:line="240" w:lineRule="auto"/>
+        <w:ind w:left="360"/>
+        <w:jc w:val="both"/>
+        <w:rPr>
+          <w:rFonts w:ascii="Times New Roman" w:hAnsi="Times New Roman"/>
+        </w:rPr>
+      </w:pPr>
+      <w:r>
+        <w:rPr>
+          <w:rFonts w:ascii="Times New Roman" w:hAnsi="Times New Roman"/>
+        </w:rPr>
+        <w:t xml:space="preserve">En el archivo de Figma, el modo </w:t>
+      </w:r>
+      <w:r>
+        <w:rPr>
+          <w:rFonts w:ascii="Times New Roman" w:hAnsi="Times New Roman"/>
+          <w:b/>
+        </w:rPr>
+        <w:t xml:space="preserve">Presentar</w:t>
+      </w:r>
+      <w:r>
+        <w:rPr>
+          <w:rFonts w:ascii="Times New Roman" w:hAnsi="Times New Roman"/>
+        </w:rPr>
+        <w:t xml:space="preserve"> ofrece tres flujos de inicio: «Flujo 1 · Realizar y confirmar un pedido», «Flujo 2 · Modificar el pedido antes de pagar» y «Estado · Pago rechazado»; todos los botones y enlaces de las pantallas están conectados. El prototipo HTML también está publicado en GitHub Pages: https://hlagua.github.io/APE4_Fase1/</w:t>
+      </w:r>
+    </w:p>
+    <w:p>
+      <w:pPr>
+        <w:spacing w:after="120" w:line="240" w:lineRule="auto"/>
+        <w:ind w:left="360"/>
+        <w:jc w:val="both"/>
+        <w:rPr>
+          <w:rFonts w:ascii="Times New Roman" w:hAnsi="Times New Roman"/>
+        </w:rPr>
+      </w:pPr>
+      <w:r>
+        <w:rPr>
+          <w:rFonts w:ascii="Times New Roman" w:hAnsi="Times New Roman"/>
+        </w:rPr>
+        <w:t xml:space="preserve">Para completar la aplicación se diseñaron siete wireframes (la guía pide un mínimo de cuatro) en escala de grises, con el mismo marco y los mismos componentes, y se conectaron como </w:t>
+      </w:r>
+      <w:r>
+        <w:rPr>
+          <w:rFonts w:ascii="Times New Roman" w:hAnsi="Times New Roman"/>
+          <w:b/>
+        </w:rPr>
         <w:t xml:space="preserve">prototipo navegable</w:t>
       </w:r>
       <w:r>
         <w:rPr>
           <w:rFonts w:ascii="Times New Roman" w:hAnsi="Times New Roman"/>
         </w:rPr>
-        <w:t xml:space="preserve"> (carpeta 07_prototipo del repositorio) en el que se pueden ejecutar las dos tareas.</w:t>
+        <w:t xml:space="preserve"> en Figma y en HTML (carpeta 07_prototipo del repositorio), en el que se pueden ejecutar las dos tareas.</w:t>
       </w:r>
     </w:p>
     <w:tbl>
@@ -10007,7 +10063,7 @@
         <w:rPr>
           <w:rFonts w:ascii="Times New Roman" w:hAnsi="Times New Roman"/>
         </w:rPr>
-        <w:t xml:space="preserve"> del repositorio del grupo contiene los productos pedidos por la guía:</w:t>
+        <w:t xml:space="preserve"> del repositorio del grupo (https://github.com/Hlagua/APE4_Fase1) contiene los productos pedidos por la guía:</w:t>
       </w:r>
     </w:p>
     <w:tbl>
@@ -10378,7 +10434,7 @@
                 <w:sz w:val="19"/>
                 <w:szCs w:val="19"/>
               </w:rPr>
-              <w:t xml:space="preserve">Prototipo navegable de baja fidelidad.</w:t>
+              <w:t xml:space="preserve">Prototipo navegable de baja fidelidad (publicado en https://hlagua.github.io/APE4_Fase1/).</w:t>
             </w:r>
           </w:p>
         </w:tc>
@@ -10401,6 +10457,47 @@
                 <w:sz w:val="19"/>
                 <w:szCs w:val="19"/>
               </w:rPr>
+              <w:t xml:space="preserve">08_protocolo_pruebas_usabilidad.md</w:t>
+            </w:r>
+          </w:p>
+        </w:tc>
+        <w:tc>
+          <w:tcPr>
+            <w:tcW w:w="4844" w:type="dxa"/>
+          </w:tcPr>
+          <w:p>
+            <w:pPr>
+              <w:spacing w:before="20" w:after="20" w:line="240" w:lineRule="auto"/>
+            </w:pPr>
+            <w:r>
+              <w:rPr>
+                <w:rFonts w:ascii="Times New Roman" w:hAnsi="Times New Roman"/>
+                <w:sz w:val="19"/>
+                <w:szCs w:val="19"/>
+              </w:rPr>
+              <w:t xml:space="preserve">Casos de prueba CP-01 a CP-05, heurísticas verificadas y métricas SUS y SEQ previstas.</w:t>
+            </w:r>
+          </w:p>
+        </w:tc>
+      </w:tr>
+      <w:tr>
+        <w:trPr>
+          <w:cantSplit/>
+        </w:trPr>
+        <w:tc>
+          <w:tcPr>
+            <w:tcW w:w="3300" w:type="dxa"/>
+          </w:tcPr>
+          <w:p>
+            <w:pPr>
+              <w:spacing w:before="20" w:after="20" w:line="240" w:lineRule="auto"/>
+            </w:pPr>
+            <w:r>
+              <w:rPr>
+                <w:rFonts w:ascii="Times New Roman" w:hAnsi="Times New Roman"/>
+                <w:sz w:val="19"/>
+                <w:szCs w:val="19"/>
+              </w:rPr>
               <w:t xml:space="preserve">README.md</w:t>
             </w:r>
           </w:p>
@@ -10419,7 +10516,7 @@
                 <w:sz w:val="19"/>
                 <w:szCs w:val="19"/>
               </w:rPr>
-              <w:t xml:space="preserve">Índice de la carpeta y enlace al prototipo de Figma.</w:t>
+              <w:t xml:space="preserve">Índice de la carpeta, integrantes y enlaces al prototipo de Figma y a GitHub Pages.</w:t>
             </w:r>
           </w:p>
         </w:tc>

</xml_diff>